<commit_message>
spec: 2026-06-03 — in-app services lock (vendor-template pricing + always-on/lifecycle-exempt + supplementary/non-saturating)
Three DECISION_LOG rows locking how Setnayan in-app services behave, all keyed off is_setnayan_service (no new schema):
- pricing = the existing vendor Universal Service Template (per-pax/hour/event + add-ons + inclusions); no admin SKU catalog.
- always-on + add-and-pay (0034); exempt from the external-vendor inquiry/schedule/capacity lifecycle.
- supplementary; never saturates a category or blocks an external vendor (excluded from the finalizeVendor one-per-category gate).

Clarifying notes added to 0021, 0022, Service_Schedule_and_Quotation_Flow §3, Schedule_Matrix §1; .docx mirrors regenerated.

Co-Authored-By: Claude Opus 4.8 <noreply@anthropic.com>
</commit_message>
<xml_diff>
--- a/0021_couple_dashboard_fully_purchased/0021_couple_dashboard_fully_purchased.docx
+++ b/0021_couple_dashboard_fully_purchased/0021_couple_dashboard_fully_purchased.docx
@@ -2,7 +2,7 @@
 <file path=word/document.xml><?xml version="1.0" encoding="utf-8"?>
 <w:document xmlns:w="http://schemas.openxmlformats.org/wordprocessingml/2006/main" xmlns:m="http://schemas.openxmlformats.org/officeDocument/2006/math" xmlns:r="http://schemas.openxmlformats.org/officeDocument/2006/relationships" xmlns:o="urn:schemas-microsoft-com:office:office" xmlns:v="urn:schemas-microsoft-com:vml" xmlns:w10="urn:schemas-microsoft-com:office:word" xmlns:a="http://schemas.openxmlformats.org/drawingml/2006/main" xmlns:pic="http://schemas.openxmlformats.org/drawingml/2006/picture" xmlns:wp="http://schemas.openxmlformats.org/drawingml/2006/wordprocessingDrawing">
   <w:body>
-    <w:bookmarkStart w:id="110" w:name="couple-dashboard-fully-purchased-state"/>
+    <w:bookmarkStart w:id="112" w:name="couple-dashboard-fully-purchased-state"/>
     <w:p>
       <w:pPr>
         <w:pStyle w:val="Heading1"/>
@@ -1013,7 +1013,7 @@
     </w:p>
     <w:bookmarkEnd w:id="10"/>
     <w:bookmarkEnd w:id="11"/>
-    <w:bookmarkStart w:id="29" w:name="the-8-surfaces"/>
+    <w:bookmarkStart w:id="31" w:name="the-8-surfaces"/>
     <w:p>
       <w:pPr>
         <w:pStyle w:val="Heading2"/>
@@ -2311,7 +2311,460 @@
         <w:t xml:space="preserve">float-to-top + the listing’s category tags) does the work.</w:t>
       </w:r>
     </w:p>
-    <w:bookmarkStart w:id="15" w:name="Xdc73e3bb6180239081bdc3182ee1a42f299b277"/>
+    <w:p>
+      <w:pPr>
+        <w:pStyle w:val="BodyText"/>
+      </w:pPr>
+      <w:r>
+        <w:rPr>
+          <w:b/>
+          <w:bCs/>
+        </w:rPr>
+        <w:t xml:space="preserve">Pricing is the vendor template + shown per unit (clarified 2026-06-03).</w:t>
+      </w:r>
+      <w:r>
+        <w:t xml:space="preserve"> </w:t>
+      </w:r>
+      <w:r>
+        <w:t xml:space="preserve">Because each Setnayan service is a listing on the Setnayan first-party vendor account, its</w:t>
+      </w:r>
+      <w:r>
+        <w:t xml:space="preserve"> </w:t>
+      </w:r>
+      <w:r>
+        <w:rPr>
+          <w:b/>
+          <w:bCs/>
+        </w:rPr>
+        <w:t xml:space="preserve">cost model is the Universal Service Template</w:t>
+      </w:r>
+      <w:r>
+        <w:t xml:space="preserve"> </w:t>
+      </w:r>
+      <w:r>
+        <w:t xml:space="preserve">the team fills there (</w:t>
+      </w:r>
+      <w:hyperlink r:id="rId15">
+        <w:r>
+          <w:rPr>
+            <w:rStyle w:val="Hyperlink"/>
+          </w:rPr>
+          <w:t xml:space="preserve">Service_Specifications_2026-06-02.md</w:t>
+        </w:r>
+      </w:hyperlink>
+      <w:r>
+        <w:t xml:space="preserve">) —</w:t>
+      </w:r>
+      <w:r>
+        <w:t xml:space="preserve"> </w:t>
+      </w:r>
+      <w:r>
+        <w:rPr>
+          <w:b/>
+          <w:bCs/>
+        </w:rPr>
+        <w:t xml:space="preserve">per-pax</w:t>
+      </w:r>
+      <w:r>
+        <w:t xml:space="preserve"> </w:t>
+      </w:r>
+      <w:r>
+        <w:t xml:space="preserve">(Starting Pax + Additional Cost/pax +</w:t>
+      </w:r>
+      <w:r>
+        <w:t xml:space="preserve"> </w:t>
+      </w:r>
+      <w:r>
+        <w:rPr>
+          <w:rStyle w:val="VerbatimChar"/>
+        </w:rPr>
+        <w:t xml:space="preserve">per_pax_tiers_json</w:t>
+      </w:r>
+      <w:r>
+        <w:t xml:space="preserve">, with the 2026-06-01 100-pax floor + per-50 increment encoded as tiers),</w:t>
+      </w:r>
+      <w:r>
+        <w:t xml:space="preserve"> </w:t>
+      </w:r>
+      <w:r>
+        <w:rPr>
+          <w:b/>
+          <w:bCs/>
+        </w:rPr>
+        <w:t xml:space="preserve">per-hour / per-event</w:t>
+      </w:r>
+      <w:r>
+        <w:t xml:space="preserve"> </w:t>
+      </w:r>
+      <w:r>
+        <w:t xml:space="preserve">(</w:t>
+      </w:r>
+      <w:r>
+        <w:rPr>
+          <w:rStyle w:val="VerbatimChar"/>
+        </w:rPr>
+        <w:t xml:space="preserve">price_unit</w:t>
+      </w:r>
+      <w:r>
+        <w:t xml:space="preserve"> </w:t>
+      </w:r>
+      <w:r>
+        <w:t xml:space="preserve">+ BASIC Time coverage),</w:t>
+      </w:r>
+      <w:r>
+        <w:t xml:space="preserve"> </w:t>
+      </w:r>
+      <w:r>
+        <w:rPr>
+          <w:b/>
+          <w:bCs/>
+        </w:rPr>
+        <w:t xml:space="preserve">added costs</w:t>
+      </w:r>
+      <w:r>
+        <w:t xml:space="preserve"> </w:t>
+      </w:r>
+      <w:r>
+        <w:t xml:space="preserve">(FEES line items), and</w:t>
+      </w:r>
+      <w:r>
+        <w:t xml:space="preserve"> </w:t>
+      </w:r>
+      <w:r>
+        <w:rPr>
+          <w:b/>
+          <w:bCs/>
+        </w:rPr>
+        <w:t xml:space="preserve">inclusions</w:t>
+      </w:r>
+      <w:r>
+        <w:t xml:space="preserve"> </w:t>
+      </w:r>
+      <w:r>
+        <w:t xml:space="preserve">(INCLUSIONS /</w:t>
+      </w:r>
+      <w:r>
+        <w:t xml:space="preserve"> </w:t>
+      </w:r>
+      <w:r>
+        <w:rPr>
+          <w:rStyle w:val="VerbatimChar"/>
+        </w:rPr>
+        <w:t xml:space="preserve">inclusions_md</w:t>
+      </w:r>
+      <w:r>
+        <w:t xml:space="preserve">). The embedded card here</w:t>
+      </w:r>
+      <w:r>
+        <w:t xml:space="preserve"> </w:t>
+      </w:r>
+      <w:r>
+        <w:rPr>
+          <w:b/>
+          <w:bCs/>
+        </w:rPr>
+        <w:t xml:space="preserve">renders the price per its unit</w:t>
+      </w:r>
+      <w:r>
+        <w:t xml:space="preserve"> </w:t>
+      </w:r>
+      <w:r>
+        <w:t xml:space="preserve">(</w:t>
+      </w:r>
+      <w:r>
+        <w:t xml:space="preserve">“₱X per event”</w:t>
+      </w:r>
+      <w:r>
+        <w:t xml:space="preserve"> </w:t>
+      </w:r>
+      <w:r>
+        <w:t xml:space="preserve">·</w:t>
+      </w:r>
+      <w:r>
+        <w:t xml:space="preserve"> </w:t>
+      </w:r>
+      <w:r>
+        <w:t xml:space="preserve">“₱X / hour”</w:t>
+      </w:r>
+      <w:r>
+        <w:t xml:space="preserve"> </w:t>
+      </w:r>
+      <w:r>
+        <w:t xml:space="preserve">·</w:t>
+      </w:r>
+      <w:r>
+        <w:t xml:space="preserve"> </w:t>
+      </w:r>
+      <w:r>
+        <w:t xml:space="preserve">“from ₱X / 100 pax”</w:t>
+      </w:r>
+      <w:r>
+        <w:t xml:space="preserve">). The legacy hardcoded in-app strip (Orders · Save the Date Video · Playlist) is</w:t>
+      </w:r>
+      <w:r>
+        <w:t xml:space="preserve"> </w:t>
+      </w:r>
+      <w:r>
+        <w:rPr>
+          <w:b/>
+          <w:bCs/>
+        </w:rPr>
+        <w:t xml:space="preserve">retired</w:t>
+      </w:r>
+      <w:r>
+        <w:t xml:space="preserve"> </w:t>
+      </w:r>
+      <w:r>
+        <w:t xml:space="preserve">— the list is sourced from the Setnayan vendor listings, not a code constant.</w:t>
+      </w:r>
+      <w:r>
+        <w:t xml:space="preserve"> </w:t>
+      </w:r>
+      <w:r>
+        <w:rPr>
+          <w:b/>
+          <w:bCs/>
+        </w:rPr>
+        <w:t xml:space="preserve">No separate admin SKU catalog / pricing-model editor</w:t>
+      </w:r>
+      <w:r>
+        <w:t xml:space="preserve"> </w:t>
+      </w:r>
+      <w:r>
+        <w:t xml:space="preserve">(see DECISION_LOG 2026-06-03</w:t>
+      </w:r>
+      <w:r>
+        <w:t xml:space="preserve"> </w:t>
+      </w:r>
+      <w:r>
+        <w:t xml:space="preserve">“🧾 In-app services pricing IS the vendor template”</w:t>
+      </w:r>
+      <w:r>
+        <w:t xml:space="preserve">).</w:t>
+      </w:r>
+    </w:p>
+    <w:p>
+      <w:pPr>
+        <w:pStyle w:val="BodyText"/>
+      </w:pPr>
+      <w:r>
+        <w:rPr>
+          <w:b/>
+          <w:bCs/>
+        </w:rPr>
+        <w:t xml:space="preserve">Always-on + add-and-pay (owner-locked 2026-06-03).</w:t>
+      </w:r>
+      <w:r>
+        <w:t xml:space="preserve"> </w:t>
+      </w:r>
+      <w:r>
+        <w:t xml:space="preserve">Because they’re Setnayan-fulfilled, in-app services are</w:t>
+      </w:r>
+      <w:r>
+        <w:t xml:space="preserve"> </w:t>
+      </w:r>
+      <w:r>
+        <w:rPr>
+          <w:b/>
+          <w:bCs/>
+        </w:rPr>
+        <w:t xml:space="preserve">exempt from the external-vendor engagement lifecycle</w:t>
+      </w:r>
+      <w:r>
+        <w:t xml:space="preserve"> </w:t>
+      </w:r>
+      <w:r>
+        <w:t xml:space="preserve">— no inquiry→accept→token→lock, no schedule date-gate, no capacity, no 7-day nudge (those would otherwise leave a Setnayan</w:t>
+      </w:r>
+      <w:r>
+        <w:t xml:space="preserve"> </w:t>
+      </w:r>
+      <w:r>
+        <w:t xml:space="preserve">“inquiry”</w:t>
+      </w:r>
+      <w:r>
+        <w:t xml:space="preserve"> </w:t>
+      </w:r>
+      <w:r>
+        <w:t xml:space="preserve">stuck in</w:t>
+      </w:r>
+      <w:r>
+        <w:t xml:space="preserve"> </w:t>
+      </w:r>
+      <w:r>
+        <w:rPr>
+          <w:rStyle w:val="VerbatimChar"/>
+        </w:rPr>
+        <w:t xml:space="preserve">requested</w:t>
+      </w:r>
+      <w:r>
+        <w:t xml:space="preserve"> </w:t>
+      </w:r>
+      <w:r>
+        <w:t xml:space="preserve">forever, and would wrongly date-gate an always-available service). The couple</w:t>
+      </w:r>
+      <w:r>
+        <w:t xml:space="preserve"> </w:t>
+      </w:r>
+      <w:r>
+        <w:rPr>
+          <w:b/>
+          <w:bCs/>
+        </w:rPr>
+        <w:t xml:space="preserve">adds and pays</w:t>
+      </w:r>
+      <w:r>
+        <w:t xml:space="preserve"> </w:t>
+      </w:r>
+      <w:r>
+        <w:t xml:space="preserve">through Setnayan checkout (</w:t>
+      </w:r>
+      <w:hyperlink r:id="rId16">
+        <w:r>
+          <w:rPr>
+            <w:rStyle w:val="Hyperlink"/>
+          </w:rPr>
+          <w:t xml:space="preserve">0034</w:t>
+        </w:r>
+      </w:hyperlink>
+      <w:r>
+        <w:t xml:space="preserve"> </w:t>
+      </w:r>
+      <w:r>
+        <w:t xml:space="preserve">apply-then-pay), available regardless of the wedding date;</w:t>
+      </w:r>
+      <w:r>
+        <w:t xml:space="preserve"> </w:t>
+      </w:r>
+      <w:r>
+        <w:rPr>
+          <w:rStyle w:val="VerbatimChar"/>
+        </w:rPr>
+        <w:t xml:space="preserve">is_setnayan_service</w:t>
+      </w:r>
+      <w:r>
+        <w:t xml:space="preserve"> </w:t>
+      </w:r>
+      <w:r>
+        <w:t xml:space="preserve">governs both the float-to-top</w:t>
+      </w:r>
+      <w:r>
+        <w:t xml:space="preserve"> </w:t>
+      </w:r>
+      <w:r>
+        <w:rPr>
+          <w:b/>
+          <w:bCs/>
+        </w:rPr>
+        <w:t xml:space="preserve">and</w:t>
+      </w:r>
+      <w:r>
+        <w:t xml:space="preserve"> </w:t>
+      </w:r>
+      <w:r>
+        <w:t xml:space="preserve">this exemption. See DECISION_LOG 2026-06-03</w:t>
+      </w:r>
+      <w:r>
+        <w:t xml:space="preserve"> </w:t>
+      </w:r>
+      <w:r>
+        <w:t xml:space="preserve">“♾️ In-app services are ALWAYS-ON + direct-checkout”</w:t>
+      </w:r>
+      <w:r>
+        <w:t xml:space="preserve">.</w:t>
+      </w:r>
+    </w:p>
+    <w:p>
+      <w:pPr>
+        <w:pStyle w:val="BodyText"/>
+      </w:pPr>
+      <w:r>
+        <w:rPr>
+          <w:b/>
+          <w:bCs/>
+        </w:rPr>
+        <w:t xml:space="preserve">Supplementary, never category-exclusive (owner-locked 2026-06-03).</w:t>
+      </w:r>
+      <w:r>
+        <w:t xml:space="preserve"> </w:t>
+      </w:r>
+      <w:r>
+        <w:t xml:space="preserve">Adding a Setnayan service does</w:t>
+      </w:r>
+      <w:r>
+        <w:t xml:space="preserve"> </w:t>
+      </w:r>
+      <w:r>
+        <w:rPr>
+          <w:b/>
+          <w:bCs/>
+        </w:rPr>
+        <w:t xml:space="preserve">not</w:t>
+      </w:r>
+      <w:r>
+        <w:t xml:space="preserve"> </w:t>
+      </w:r>
+      <w:r>
+        <w:t xml:space="preserve">saturate its category or block an external vendor in it — a couple with Papic (Photo &amp; Video) can still shortlist + lock a full external photographer in the same category; the two coexist. The hard-single / one-vendor-per-category saturation counter</w:t>
+      </w:r>
+      <w:r>
+        <w:t xml:space="preserve"> </w:t>
+      </w:r>
+      <w:r>
+        <w:rPr>
+          <w:b/>
+          <w:bCs/>
+        </w:rPr>
+        <w:t xml:space="preserve">excludes</w:t>
+      </w:r>
+      <w:r>
+        <w:rPr>
+          <w:b/>
+          <w:bCs/>
+        </w:rPr>
+        <w:t xml:space="preserve"> </w:t>
+      </w:r>
+      <w:r>
+        <w:rPr>
+          <w:rStyle w:val="VerbatimChar"/>
+          <w:b/>
+          <w:bCs/>
+        </w:rPr>
+        <w:t xml:space="preserve">is_setnayan_service</w:t>
+      </w:r>
+      <w:r>
+        <w:t xml:space="preserve"> </w:t>
+      </w:r>
+      <w:r>
+        <w:t xml:space="preserve">— Setnayan is supplementary</w:t>
+      </w:r>
+      <w:r>
+        <w:t xml:space="preserve"> </w:t>
+      </w:r>
+      <w:r>
+        <w:rPr>
+          <w:i/>
+          <w:iCs/>
+        </w:rPr>
+        <w:t xml:space="preserve">“in case they need our service,”</w:t>
+      </w:r>
+      <w:r>
+        <w:t xml:space="preserve"> </w:t>
+      </w:r>
+      <w:r>
+        <w:t xml:space="preserve">never the category’s primary vendor. See DECISION_LOG 2026-06-03</w:t>
+      </w:r>
+      <w:r>
+        <w:t xml:space="preserve"> </w:t>
+      </w:r>
+      <w:r>
+        <w:t xml:space="preserve">“➕ In-app services are SUPPLEMENTARY”</w:t>
+      </w:r>
+      <w:r>
+        <w:t xml:space="preserve">.</w:t>
+      </w:r>
+    </w:p>
+    <w:bookmarkStart w:id="17" w:name="Xdc73e3bb6180239081bdc3182ee1a42f299b277"/>
     <w:p>
       <w:pPr>
         <w:pStyle w:val="Heading3"/>
@@ -3106,8 +3559,8 @@
         <w:t xml:space="preserve">The result is a Home that scans in seconds — hero · buckets · grid — with the journey overview and Done section as supporting context. The detail still exists; it just lives where it belongs.</w:t>
       </w:r>
     </w:p>
-    <w:bookmarkEnd w:id="15"/>
-    <w:bookmarkStart w:id="16" w:name="Xe52e0df4d6ab747d0f326da673c324a87de9f71"/>
+    <w:bookmarkEnd w:id="17"/>
+    <w:bookmarkStart w:id="18" w:name="Xe52e0df4d6ab747d0f326da673c324a87de9f71"/>
     <w:p>
       <w:pPr>
         <w:pStyle w:val="Heading3"/>
@@ -3698,8 +4151,8 @@
         </w:tc>
       </w:tr>
     </w:tbl>
-    <w:bookmarkEnd w:id="16"/>
-    <w:bookmarkStart w:id="17" w:name="X2af524182dea5ab08ea3dd64bc1e79bf4e3123c"/>
+    <w:bookmarkEnd w:id="18"/>
+    <w:bookmarkStart w:id="19" w:name="X2af524182dea5ab08ea3dd64bc1e79bf4e3123c"/>
     <w:p>
       <w:pPr>
         <w:pStyle w:val="Heading3"/>
@@ -4393,8 +4846,8 @@
         <w:t xml:space="preserve">is set on first trial)</w:t>
       </w:r>
     </w:p>
-    <w:bookmarkEnd w:id="17"/>
-    <w:bookmarkStart w:id="18" w:name="enforcement-state-overlay-new-2026-05-17"/>
+    <w:bookmarkEnd w:id="19"/>
+    <w:bookmarkStart w:id="20" w:name="enforcement-state-overlay-new-2026-05-17"/>
     <w:p>
       <w:pPr>
         <w:pStyle w:val="Heading3"/>
@@ -4632,8 +5085,8 @@
         <w:t xml:space="preserve">The overlay applies whether the event is in DIY (A), Active (C), or Expired (D). It does NOT apply to events in Trial (B) — those are already mid-trial so enforcement state doesn’t change the in-trial experience until trial expiry.</w:t>
       </w:r>
     </w:p>
-    <w:bookmarkEnd w:id="18"/>
-    <w:bookmarkStart w:id="19" w:name="schema"/>
+    <w:bookmarkEnd w:id="20"/>
+    <w:bookmarkStart w:id="21" w:name="schema"/>
     <w:p>
       <w:pPr>
         <w:pStyle w:val="Heading3"/>
@@ -5801,8 +6254,8 @@
         </w:pict>
       </w:r>
     </w:p>
-    <w:bookmarkEnd w:id="19"/>
-    <w:bookmarkStart w:id="27" w:name="X76d0750b50497fb4c4b14646f845e18da6d3605"/>
+    <w:bookmarkEnd w:id="21"/>
+    <w:bookmarkStart w:id="29" w:name="X76d0750b50497fb4c4b14646f845e18da6d3605"/>
     <w:p>
       <w:pPr>
         <w:pStyle w:val="Heading3"/>
@@ -5879,7 +6332,7 @@
         <w:t xml:space="preserve">The wizard’s full architecture, schema, and behavior is locked in 0016 §§ 0b-0e. This section describes how the wizard surfaces render on 0021 Home.</w:t>
       </w:r>
     </w:p>
-    <w:bookmarkStart w:id="21" w:name="X43d43bea4a2eaaa3e14928213f2ae0f77cc2077"/>
+    <w:bookmarkStart w:id="23" w:name="X43d43bea4a2eaaa3e14928213f2ae0f77cc2077"/>
     <w:p>
       <w:pPr>
         <w:pStyle w:val="Heading4"/>
@@ -6140,7 +6593,7 @@
       <w:r>
         <w:t xml:space="preserve"> </w:t>
       </w:r>
-      <w:hyperlink r:id="rId20">
+      <w:hyperlink r:id="rId22">
         <w:r>
           <w:rPr>
             <w:rStyle w:val="VerbatimChar"/>
@@ -6176,8 +6629,8 @@
         <w:t xml:space="preserve">- No quota indicator (unlimited brain Q&amp;A)</w:t>
       </w:r>
     </w:p>
-    <w:bookmarkEnd w:id="21"/>
-    <w:bookmarkStart w:id="22" w:name="b.1-next-actions-strip"/>
+    <w:bookmarkEnd w:id="23"/>
+    <w:bookmarkStart w:id="24" w:name="b.1-next-actions-strip"/>
     <w:p>
       <w:pPr>
         <w:pStyle w:val="Heading4"/>
@@ -6482,8 +6935,8 @@
         <w:t xml:space="preserve">No banner, no upsell, no nag.</w:t>
       </w:r>
     </w:p>
-    <w:bookmarkEnd w:id="22"/>
-    <w:bookmarkStart w:id="23" w:name="X681de5fc23661ca13b977c096d9a80226e428ca"/>
+    <w:bookmarkEnd w:id="24"/>
+    <w:bookmarkStart w:id="25" w:name="X681de5fc23661ca13b977c096d9a80226e428ca"/>
     <w:p>
       <w:pPr>
         <w:pStyle w:val="Heading4"/>
@@ -6646,8 +7099,8 @@
         <w:t xml:space="preserve">).</w:t>
       </w:r>
     </w:p>
-    <w:bookmarkEnd w:id="23"/>
-    <w:bookmarkStart w:id="24" w:name="X0bded04a8385d229a4580fa4885c8d40fae7a2c"/>
+    <w:bookmarkEnd w:id="25"/>
+    <w:bookmarkStart w:id="26" w:name="X0bded04a8385d229a4580fa4885c8d40fae7a2c"/>
     <w:p>
       <w:pPr>
         <w:pStyle w:val="Heading4"/>
@@ -6763,8 +7216,8 @@
         <w:t xml:space="preserve">Builds trust + transparency. Couples see their coordinator-fee being spent on real work. Coordinator can’t ghost the couple — every action is logged with timestamp.</w:t>
       </w:r>
     </w:p>
-    <w:bookmarkEnd w:id="24"/>
-    <w:bookmarkStart w:id="25" w:name="X01260fa281c305c2119ec352d32bffb7bf42aae"/>
+    <w:bookmarkEnd w:id="26"/>
+    <w:bookmarkStart w:id="27" w:name="X01260fa281c305c2119ec352d32bffb7bf42aae"/>
     <w:p>
       <w:pPr>
         <w:pStyle w:val="Heading4"/>
@@ -7104,8 +7557,8 @@
         <w:t xml:space="preserve">Upgrade intake reduces to ~2-3 questions instead of 5 for couples who’ve been on DIY for weeks. Wizard activates immediately after submission.</w:t>
       </w:r>
     </w:p>
-    <w:bookmarkEnd w:id="25"/>
-    <w:bookmarkStart w:id="26" w:name="X0fa46a5ae06916b510f34d6f0283211cfc12650"/>
+    <w:bookmarkEnd w:id="27"/>
+    <w:bookmarkStart w:id="28" w:name="X0fa46a5ae06916b510f34d6f0283211cfc12650"/>
     <w:p>
       <w:pPr>
         <w:pStyle w:val="Heading4"/>
@@ -7357,9 +7810,9 @@
         <w:t xml:space="preserve">subsection in 0016 § 0b, nothing is deleted on downgrade. The trial-end prompt sells the wizard, not data survival.</w:t>
       </w:r>
     </w:p>
-    <w:bookmarkEnd w:id="26"/>
-    <w:bookmarkEnd w:id="27"/>
-    <w:bookmarkStart w:id="28" w:name="c-profile-avatar-dashboard-home-shortcut"/>
+    <w:bookmarkEnd w:id="28"/>
+    <w:bookmarkEnd w:id="29"/>
+    <w:bookmarkStart w:id="30" w:name="c-profile-avatar-dashboard-home-shortcut"/>
     <w:p>
       <w:pPr>
         <w:pStyle w:val="Heading3"/>
@@ -7471,9 +7924,9 @@
         </w:pict>
       </w:r>
     </w:p>
-    <w:bookmarkEnd w:id="28"/>
-    <w:bookmarkEnd w:id="29"/>
-    <w:bookmarkStart w:id="30" w:name="qr-token-rules-per-qr-type-locked"/>
+    <w:bookmarkEnd w:id="30"/>
+    <w:bookmarkEnd w:id="31"/>
+    <w:bookmarkStart w:id="32" w:name="qr-token-rules-per-qr-type-locked"/>
     <w:p>
       <w:pPr>
         <w:pStyle w:val="Heading2"/>
@@ -8325,8 +8778,8 @@
         </w:pict>
       </w:r>
     </w:p>
-    <w:bookmarkEnd w:id="30"/>
-    <w:bookmarkStart w:id="31" w:name="X2965c73cb583e0ef466fb7e694b261e6e34b061"/>
+    <w:bookmarkEnd w:id="32"/>
+    <w:bookmarkStart w:id="33" w:name="X2965c73cb583e0ef466fb7e694b261e6e34b061"/>
     <w:p>
       <w:pPr>
         <w:pStyle w:val="Heading2"/>
@@ -8527,8 +8980,8 @@
         </w:pict>
       </w:r>
     </w:p>
-    <w:bookmarkEnd w:id="31"/>
-    <w:bookmarkStart w:id="32" w:name="X7ebcfd2e1f59beb263abd691d476ab52a034d64"/>
+    <w:bookmarkEnd w:id="33"/>
+    <w:bookmarkStart w:id="34" w:name="X7ebcfd2e1f59beb263abd691d476ab52a034d64"/>
     <w:p>
       <w:pPr>
         <w:pStyle w:val="Heading2"/>
@@ -8822,8 +9275,8 @@
         </w:pict>
       </w:r>
     </w:p>
-    <w:bookmarkEnd w:id="32"/>
-    <w:bookmarkStart w:id="33" w:name="Xc23cfae8c5c2bb6e0d83444c74fb05d64f97e18"/>
+    <w:bookmarkEnd w:id="34"/>
+    <w:bookmarkStart w:id="35" w:name="Xc23cfae8c5c2bb6e0d83444c74fb05d64f97e18"/>
     <w:p>
       <w:pPr>
         <w:pStyle w:val="Heading2"/>
@@ -9342,8 +9795,8 @@
         </w:pict>
       </w:r>
     </w:p>
-    <w:bookmarkEnd w:id="33"/>
-    <w:bookmarkStart w:id="34" w:name="b-mobile-vital-info-rule-locked"/>
+    <w:bookmarkEnd w:id="35"/>
+    <w:bookmarkStart w:id="36" w:name="b-mobile-vital-info-rule-locked"/>
     <w:p>
       <w:pPr>
         <w:pStyle w:val="Heading2"/>
@@ -9607,8 +10060,8 @@
         </w:pict>
       </w:r>
     </w:p>
-    <w:bookmarkEnd w:id="34"/>
-    <w:bookmarkStart w:id="35" w:name="c-vendor-ingress-egress-locked"/>
+    <w:bookmarkEnd w:id="36"/>
+    <w:bookmarkStart w:id="37" w:name="c-vendor-ingress-egress-locked"/>
     <w:p>
       <w:pPr>
         <w:pStyle w:val="Heading2"/>
@@ -9742,8 +10195,8 @@
         </w:pict>
       </w:r>
     </w:p>
-    <w:bookmarkEnd w:id="35"/>
-    <w:bookmarkStart w:id="36" w:name="X5b16e3720a659ad179b2bc039689c92b31ea89b"/>
+    <w:bookmarkEnd w:id="37"/>
+    <w:bookmarkStart w:id="38" w:name="X5b16e3720a659ad179b2bc039689c92b31ea89b"/>
     <w:p>
       <w:pPr>
         <w:pStyle w:val="Heading2"/>
@@ -10128,8 +10581,8 @@
         </w:pict>
       </w:r>
     </w:p>
-    <w:bookmarkEnd w:id="36"/>
-    <w:bookmarkStart w:id="37" w:name="e-upgrade-to-___-prompts-locked"/>
+    <w:bookmarkEnd w:id="38"/>
+    <w:bookmarkStart w:id="39" w:name="e-upgrade-to-___-prompts-locked"/>
     <w:p>
       <w:pPr>
         <w:pStyle w:val="Heading2"/>
@@ -10305,8 +10758,8 @@
         </w:pict>
       </w:r>
     </w:p>
-    <w:bookmarkEnd w:id="37"/>
-    <w:bookmarkStart w:id="42" w:name="X66853f761897319f006a479542c9c4541fe8d92"/>
+    <w:bookmarkEnd w:id="39"/>
+    <w:bookmarkStart w:id="44" w:name="X66853f761897319f006a479542c9c4541fe8d92"/>
     <w:p>
       <w:pPr>
         <w:pStyle w:val="Heading2"/>
@@ -10323,7 +10776,7 @@
         <w:t xml:space="preserve">The following four mechanisms surface but are not yet built in this couple-facing prototype. They land in iteration 0022 (the vendor dashboard prototype):</w:t>
       </w:r>
     </w:p>
-    <w:bookmarkStart w:id="38" w:name="Xd2f0e37433777ce8be51ea3b2552992785c3785"/>
+    <w:bookmarkStart w:id="40" w:name="Xd2f0e37433777ce8be51ea3b2552992785c3785"/>
     <w:p>
       <w:pPr>
         <w:pStyle w:val="Heading3"/>
@@ -10417,8 +10870,8 @@
         <w:t xml:space="preserve">Free vendors (non-Pro) retain basic visibility on the marketplace + chat with couples + accept bookings — but skip the Pro scheduler / multi-service calendar / QR-per-guest retrieval features.</w:t>
       </w:r>
     </w:p>
-    <w:bookmarkEnd w:id="38"/>
-    <w:bookmarkStart w:id="39" w:name="X24ab9646794ffc8c681cbe496e9d329e02e45fc"/>
+    <w:bookmarkEnd w:id="40"/>
+    <w:bookmarkStart w:id="41" w:name="X24ab9646794ffc8c681cbe496e9d329e02e45fc"/>
     <w:p>
       <w:pPr>
         <w:pStyle w:val="Heading3"/>
@@ -10481,8 +10934,8 @@
         <w:t xml:space="preserve">— one per service — plus a unified master view. Each service-calendar shows that service’s bookings, blocks, and lead-time requirements. Premium-tier feature; non-Pro vendors get a single combined calendar.</w:t>
       </w:r>
     </w:p>
-    <w:bookmarkEnd w:id="39"/>
-    <w:bookmarkStart w:id="40" w:name="X6bafb0c4a77aaddf4073281f11a4722b78150b0"/>
+    <w:bookmarkEnd w:id="41"/>
+    <w:bookmarkStart w:id="42" w:name="X6bafb0c4a77aaddf4073281f11a4722b78150b0"/>
     <w:p>
       <w:pPr>
         <w:pStyle w:val="Heading3"/>
@@ -10645,8 +11098,8 @@
         <w:t xml:space="preserve">.</w:t>
       </w:r>
     </w:p>
-    <w:bookmarkEnd w:id="40"/>
-    <w:bookmarkStart w:id="41" w:name="Xfb05dc12f10a0569475b928a5d19fcd7e22b3e2"/>
+    <w:bookmarkEnd w:id="42"/>
+    <w:bookmarkStart w:id="43" w:name="Xfb05dc12f10a0569475b928a5d19fcd7e22b3e2"/>
     <w:p>
       <w:pPr>
         <w:pStyle w:val="Heading3"/>
@@ -10670,9 +11123,9 @@
         </w:pict>
       </w:r>
     </w:p>
-    <w:bookmarkEnd w:id="41"/>
-    <w:bookmarkEnd w:id="42"/>
-    <w:bookmarkStart w:id="43" w:name="b-mobile-vendor-card-pattern-locked"/>
+    <w:bookmarkEnd w:id="43"/>
+    <w:bookmarkEnd w:id="44"/>
+    <w:bookmarkStart w:id="45" w:name="b-mobile-vendor-card-pattern-locked"/>
     <w:p>
       <w:pPr>
         <w:pStyle w:val="Heading2"/>
@@ -11054,8 +11507,8 @@
         <w:t xml:space="preserve">The card is the touch-zone for the whole interaction. Only one card expanded at a time on mobile.</w:t>
       </w:r>
     </w:p>
-    <w:bookmarkEnd w:id="43"/>
-    <w:bookmarkStart w:id="46" w:name="X5b4cd2613e92676dc4d06d0900a5484c14a7c85"/>
+    <w:bookmarkEnd w:id="45"/>
+    <w:bookmarkStart w:id="48" w:name="X5b4cd2613e92676dc4d06d0900a5484c14a7c85"/>
     <w:p>
       <w:pPr>
         <w:pStyle w:val="Heading2"/>
@@ -11462,7 +11915,7 @@
         </w:pict>
       </w:r>
     </w:p>
-    <w:bookmarkStart w:id="44" w:name="Xc54d9ec299817afa3a0efa55442294316b073a1"/>
+    <w:bookmarkStart w:id="46" w:name="Xc54d9ec299817afa3a0efa55442294316b073a1"/>
     <w:p>
       <w:pPr>
         <w:pStyle w:val="Heading3"/>
@@ -11732,8 +12185,8 @@
         </w:pict>
       </w:r>
     </w:p>
-    <w:bookmarkEnd w:id="44"/>
-    <w:bookmarkStart w:id="45" w:name="Xf30acead0b9070798232240a983cdf730b44ab7"/>
+    <w:bookmarkEnd w:id="46"/>
+    <w:bookmarkStart w:id="47" w:name="Xf30acead0b9070798232240a983cdf730b44ab7"/>
     <w:p>
       <w:pPr>
         <w:pStyle w:val="Heading3"/>
@@ -11769,9 +12222,9 @@
         </w:pict>
       </w:r>
     </w:p>
-    <w:bookmarkEnd w:id="45"/>
-    <w:bookmarkEnd w:id="46"/>
-    <w:bookmarkStart w:id="48" w:name="d-review-visibility-rule-locked"/>
+    <w:bookmarkEnd w:id="47"/>
+    <w:bookmarkEnd w:id="48"/>
+    <w:bookmarkStart w:id="50" w:name="d-review-visibility-rule-locked"/>
     <w:p>
       <w:pPr>
         <w:pStyle w:val="Heading2"/>
@@ -12472,7 +12925,7 @@
         <w:t xml:space="preserve">The same rule applies to all 8 of their vendors: review surfaces stay quiet during planning, then activate together post-event.</w:t>
       </w:r>
     </w:p>
-    <w:bookmarkStart w:id="47" w:name="d.i-self-review-block-locked-2026-05-15"/>
+    <w:bookmarkStart w:id="49" w:name="d.i-self-review-block-locked-2026-05-15"/>
     <w:p>
       <w:pPr>
         <w:pStyle w:val="Heading3"/>
@@ -12856,9 +13309,9 @@
         </w:pict>
       </w:r>
     </w:p>
-    <w:bookmarkEnd w:id="47"/>
-    <w:bookmarkEnd w:id="48"/>
-    <w:bookmarkStart w:id="49" w:name="the-services-vs-home-rule-locked"/>
+    <w:bookmarkEnd w:id="49"/>
+    <w:bookmarkEnd w:id="50"/>
+    <w:bookmarkStart w:id="51" w:name="the-services-vs-home-rule-locked"/>
     <w:p>
       <w:pPr>
         <w:pStyle w:val="Heading2"/>
@@ -12980,8 +13433,8 @@
         </w:pict>
       </w:r>
     </w:p>
-    <w:bookmarkEnd w:id="49"/>
-    <w:bookmarkStart w:id="56" w:name="X7d3c0f177e1fa6745f37036f1c266588ed0813f"/>
+    <w:bookmarkEnd w:id="51"/>
+    <w:bookmarkStart w:id="58" w:name="X7d3c0f177e1fa6745f37036f1c266588ed0813f"/>
     <w:p>
       <w:pPr>
         <w:pStyle w:val="Heading2"/>
@@ -13010,7 +13463,7 @@
         <w:t xml:space="preserve">This is the most opinionated screen in the dashboard. It’s the daily-driver — the couple lands here when they open Setnayan, and it tells them, in order of importance:</w:t>
       </w:r>
     </w:p>
-    <w:bookmarkStart w:id="50" w:name="lifecycle-stage-banner"/>
+    <w:bookmarkStart w:id="52" w:name="lifecycle-stage-banner"/>
     <w:p>
       <w:pPr>
         <w:pStyle w:val="Heading3"/>
@@ -13069,8 +13522,8 @@
         <w:t xml:space="preserve">.</w:t>
       </w:r>
     </w:p>
-    <w:bookmarkEnd w:id="50"/>
-    <w:bookmarkStart w:id="51" w:name="whats-next-cards-3-cards"/>
+    <w:bookmarkEnd w:id="52"/>
+    <w:bookmarkStart w:id="53" w:name="whats-next-cards-3-cards"/>
     <w:p>
       <w:pPr>
         <w:pStyle w:val="Heading3"/>
@@ -13200,8 +13653,8 @@
         <w:t xml:space="preserve">These cards are dynamic — they shift as items complete.</w:t>
       </w:r>
     </w:p>
-    <w:bookmarkEnd w:id="51"/>
-    <w:bookmarkStart w:id="52" w:name="active-apparatus-summary"/>
+    <w:bookmarkEnd w:id="53"/>
+    <w:bookmarkStart w:id="54" w:name="active-apparatus-summary"/>
     <w:p>
       <w:pPr>
         <w:pStyle w:val="Heading3"/>
@@ -13378,8 +13831,8 @@
         <w:t xml:space="preserve">total appears below the strip.</w:t>
       </w:r>
     </w:p>
-    <w:bookmarkEnd w:id="52"/>
-    <w:bookmarkStart w:id="53" w:name="vendor-pulse"/>
+    <w:bookmarkEnd w:id="54"/>
+    <w:bookmarkStart w:id="55" w:name="vendor-pulse"/>
     <w:p>
       <w:pPr>
         <w:pStyle w:val="Heading3"/>
@@ -13396,8 +13849,8 @@
         <w:t xml:space="preserve">8 booked-vendor avatars across one row, each with a tiny progress ring showing % of milestones paid. Click any avatar → vendor detail.</w:t>
       </w:r>
     </w:p>
-    <w:bookmarkEnd w:id="53"/>
-    <w:bookmarkStart w:id="54" w:name="recent-activity-feed"/>
+    <w:bookmarkEnd w:id="55"/>
+    <w:bookmarkStart w:id="56" w:name="recent-activity-feed"/>
     <w:p>
       <w:pPr>
         <w:pStyle w:val="Heading3"/>
@@ -13485,8 +13938,8 @@
         <w:t xml:space="preserve">This is the couple’s audit trail — exposed in a friendly format.</w:t>
       </w:r>
     </w:p>
-    <w:bookmarkEnd w:id="54"/>
-    <w:bookmarkStart w:id="55" w:name="quick-actions-row"/>
+    <w:bookmarkEnd w:id="56"/>
+    <w:bookmarkStart w:id="57" w:name="quick-actions-row"/>
     <w:p>
       <w:pPr>
         <w:pStyle w:val="Heading3"/>
@@ -13546,9 +13999,9 @@
         </w:pict>
       </w:r>
     </w:p>
-    <w:bookmarkEnd w:id="55"/>
-    <w:bookmarkEnd w:id="56"/>
-    <w:bookmarkStart w:id="61" w:name="per-tab-content-fully-loaded-state"/>
+    <w:bookmarkEnd w:id="57"/>
+    <w:bookmarkEnd w:id="58"/>
+    <w:bookmarkStart w:id="63" w:name="per-tab-content-fully-loaded-state"/>
     <w:p>
       <w:pPr>
         <w:pStyle w:val="Heading2"/>
@@ -13557,7 +14010,7 @@
         <w:t xml:space="preserve">4. Per-tab content (fully-loaded state)</w:t>
       </w:r>
     </w:p>
-    <w:bookmarkStart w:id="57" w:name="guest-list"/>
+    <w:bookmarkStart w:id="59" w:name="guest-list"/>
     <w:p>
       <w:pPr>
         <w:pStyle w:val="Heading3"/>
@@ -13645,8 +14098,8 @@
         <w:t xml:space="preserve">“Export contact list.”</w:t>
       </w:r>
     </w:p>
-    <w:bookmarkEnd w:id="57"/>
-    <w:bookmarkStart w:id="58" w:name="vendors"/>
+    <w:bookmarkEnd w:id="59"/>
+    <w:bookmarkStart w:id="60" w:name="vendors"/>
     <w:p>
       <w:pPr>
         <w:pStyle w:val="Heading3"/>
@@ -13689,8 +14142,8 @@
         <w:t xml:space="preserve">; warning amber for any canonical that’s empty AND marked needed.</w:t>
       </w:r>
     </w:p>
-    <w:bookmarkEnd w:id="58"/>
-    <w:bookmarkStart w:id="59" w:name="schedule"/>
+    <w:bookmarkEnd w:id="60"/>
+    <w:bookmarkStart w:id="61" w:name="schedule"/>
     <w:p>
       <w:pPr>
         <w:pStyle w:val="Heading3"/>
@@ -13715,8 +14168,8 @@
         <w:t xml:space="preserve">Below: upcoming meetings (T-14 to T-1) — a vertical list of 14 vendor meetings with date, vendor, mode (in-person/video), and quick-join link.</w:t>
       </w:r>
     </w:p>
-    <w:bookmarkEnd w:id="59"/>
-    <w:bookmarkStart w:id="60" w:name="add-ons"/>
+    <w:bookmarkEnd w:id="61"/>
+    <w:bookmarkStart w:id="62" w:name="add-ons"/>
     <w:p>
       <w:pPr>
         <w:pStyle w:val="Heading3"/>
@@ -13752,9 +14205,9 @@
         </w:pict>
       </w:r>
     </w:p>
-    <w:bookmarkEnd w:id="60"/>
-    <w:bookmarkEnd w:id="61"/>
-    <w:bookmarkStart w:id="62" w:name="visual-hierarchy"/>
+    <w:bookmarkEnd w:id="62"/>
+    <w:bookmarkEnd w:id="63"/>
+    <w:bookmarkStart w:id="64" w:name="visual-hierarchy"/>
     <w:p>
       <w:pPr>
         <w:pStyle w:val="Heading2"/>
@@ -13817,8 +14270,8 @@
         </w:pict>
       </w:r>
     </w:p>
-    <w:bookmarkEnd w:id="62"/>
-    <w:bookmarkStart w:id="63" w:name="what-this-prototype-is-not"/>
+    <w:bookmarkEnd w:id="64"/>
+    <w:bookmarkStart w:id="65" w:name="what-this-prototype-is-not"/>
     <w:p>
       <w:pPr>
         <w:pStyle w:val="Heading2"/>
@@ -13870,8 +14323,8 @@
         </w:pict>
       </w:r>
     </w:p>
-    <w:bookmarkEnd w:id="63"/>
-    <w:bookmarkStart w:id="64" w:name="Xd4881637e7acba4a4ba0743ec8ee3c62da9c61c"/>
+    <w:bookmarkEnd w:id="65"/>
+    <w:bookmarkStart w:id="66" w:name="Xd4881637e7acba4a4ba0743ec8ee3c62da9c61c"/>
     <w:p>
       <w:pPr>
         <w:pStyle w:val="Heading2"/>
@@ -14415,8 +14868,8 @@
         </w:pict>
       </w:r>
     </w:p>
-    <w:bookmarkEnd w:id="64"/>
-    <w:bookmarkStart w:id="65" w:name="Xfbf23315eb3568f441ca2dcfa02c475643c2704"/>
+    <w:bookmarkEnd w:id="66"/>
+    <w:bookmarkStart w:id="67" w:name="Xfbf23315eb3568f441ca2dcfa02c475643c2704"/>
     <w:p>
       <w:pPr>
         <w:pStyle w:val="Heading2"/>
@@ -14748,8 +15201,8 @@
         </w:pict>
       </w:r>
     </w:p>
-    <w:bookmarkEnd w:id="65"/>
-    <w:bookmarkStart w:id="76" w:name="Xbdd03ec5eddd431794cc66ff0cb61cd7d3b6cbf"/>
+    <w:bookmarkEnd w:id="67"/>
+    <w:bookmarkStart w:id="78" w:name="Xbdd03ec5eddd431794cc66ff0cb61cd7d3b6cbf"/>
     <w:p>
       <w:pPr>
         <w:pStyle w:val="Heading2"/>
@@ -14791,7 +15244,7 @@
         <w:t xml:space="preserve">Additionally subject to per-vendor acceptance cutoffs (§ 13) — if any confirmed vendor is past their date-change cutoff at the current proximity to event, the standard flow described below is blocked entirely and admin override is the only forward path.</w:t>
       </w:r>
     </w:p>
-    <w:bookmarkStart w:id="66" w:name="X2a6683d9bbe2dbe27b885d8693f9c800b9aeb49"/>
+    <w:bookmarkStart w:id="68" w:name="X2a6683d9bbe2dbe27b885d8693f9c800b9aeb49"/>
     <w:p>
       <w:pPr>
         <w:pStyle w:val="Heading3"/>
@@ -15132,8 +15585,8 @@
         <w:t xml:space="preserve">Tone is informative, not alarmist — couples reaching this modal are usually already stressed (venue flooded, family conflict, force majeure, work transfer). The reason field is required because every change involving booked vendors must have a documented motivation — vendors receive it in their schedule-change notification (so they understand the ask before deciding), and admin reviews patterns if a dispute later escalates.</w:t>
       </w:r>
     </w:p>
-    <w:bookmarkEnd w:id="66"/>
-    <w:bookmarkStart w:id="67" w:name="schedule-check-customer-facing-result"/>
+    <w:bookmarkEnd w:id="68"/>
+    <w:bookmarkStart w:id="69" w:name="schedule-check-customer-facing-result"/>
     <w:p>
       <w:pPr>
         <w:pStyle w:val="Heading3"/>
@@ -15245,8 +15698,8 @@
         <w:t xml:space="preserve">“Date change pending vendor confirmation · N of M responded.”</w:t>
       </w:r>
     </w:p>
-    <w:bookmarkEnd w:id="67"/>
-    <w:bookmarkStart w:id="68" w:name="pending-state-freeze"/>
+    <w:bookmarkEnd w:id="69"/>
+    <w:bookmarkStart w:id="70" w:name="pending-state-freeze"/>
     <w:p>
       <w:pPr>
         <w:pStyle w:val="Heading3"/>
@@ -15369,8 +15822,8 @@
         <w:t xml:space="preserve">This prevents either party from moving the goalposts mid-negotiation.</w:t>
       </w:r>
     </w:p>
-    <w:bookmarkEnd w:id="68"/>
-    <w:bookmarkStart w:id="69" w:name="X791f656426906cf4acbde434957c84fd9dcde88"/>
+    <w:bookmarkEnd w:id="70"/>
+    <w:bookmarkStart w:id="71" w:name="X791f656426906cf4acbde434957c84fd9dcde88"/>
     <w:p>
       <w:pPr>
         <w:pStyle w:val="Heading3"/>
@@ -15562,8 +16015,8 @@
         </w:tc>
       </w:tr>
     </w:tbl>
-    <w:bookmarkEnd w:id="69"/>
-    <w:bookmarkStart w:id="70" w:name="chat-negotiation-decline-path"/>
+    <w:bookmarkEnd w:id="71"/>
+    <w:bookmarkStart w:id="72" w:name="chat-negotiation-decline-path"/>
     <w:p>
       <w:pPr>
         <w:pStyle w:val="Heading3"/>
@@ -15842,8 +16295,8 @@
         <w:t xml:space="preserve">(no message and no card interaction), the change request auto-cancels and the event reverts to the original date. The vendor receives a notification that the negotiation closed without resolution.</w:t>
       </w:r>
     </w:p>
-    <w:bookmarkEnd w:id="70"/>
-    <w:bookmarkStart w:id="71" w:name="admin-mediation-tier-escalation"/>
+    <w:bookmarkEnd w:id="72"/>
+    <w:bookmarkStart w:id="73" w:name="admin-mediation-tier-escalation"/>
     <w:p>
       <w:pPr>
         <w:pStyle w:val="Heading3"/>
@@ -16117,8 +16570,8 @@
         <w:t xml:space="preserve">and the chosen outcome enum.</w:t>
       </w:r>
     </w:p>
-    <w:bookmarkEnd w:id="71"/>
-    <w:bookmarkStart w:id="72" w:name="X314ac3e3defab2e4df90995ff2eb588e36a8a4f"/>
+    <w:bookmarkEnd w:id="73"/>
+    <w:bookmarkStart w:id="74" w:name="X314ac3e3defab2e4df90995ff2eb588e36a8a4f"/>
     <w:p>
       <w:pPr>
         <w:pStyle w:val="Heading3"/>
@@ -16202,8 +16655,8 @@
         <w:t xml:space="preserve">→ negotiation continues with the remaining vendors only; the departed vendor’s slot releases independently. The couple’s pending-state banner updates to reflect the new vendor count.</w:t>
       </w:r>
     </w:p>
-    <w:bookmarkEnd w:id="72"/>
-    <w:bookmarkStart w:id="73" w:name="door-reopened-banner"/>
+    <w:bookmarkEnd w:id="74"/>
+    <w:bookmarkStart w:id="75" w:name="door-reopened-banner"/>
     <w:p>
       <w:pPr>
         <w:pStyle w:val="Heading3"/>
@@ -16248,8 +16701,8 @@
         <w:t xml:space="preserve">Banner placement: directly below the NEXT UP hero card on Home (per § 2.0a). Dismisses on first date-edit attempt OR after 14 days. Without this affordance, couples may not realize the gate has lifted — many continue planning around the old date long after the constraint dissolved.</w:t>
       </w:r>
     </w:p>
-    <w:bookmarkEnd w:id="73"/>
-    <w:bookmarkStart w:id="74" w:name="X39bc330035ec3c2c4ab3cb8c006903bf94ee264"/>
+    <w:bookmarkEnd w:id="75"/>
+    <w:bookmarkStart w:id="76" w:name="X39bc330035ec3c2c4ab3cb8c006903bf94ee264"/>
     <w:p>
       <w:pPr>
         <w:pStyle w:val="Heading3"/>
@@ -16331,8 +16784,8 @@
         <w:t xml:space="preserve">— the mediator references the vendor’s stated policy when negotiating outcomes in § 10.6 and applies the fee via the existing 0034 milestone-payment flow. Automated fee debits land in iteration 0034 Phase 2.</w:t>
       </w:r>
     </w:p>
-    <w:bookmarkEnd w:id="74"/>
-    <w:bookmarkStart w:id="75" w:name="max-date-changes-per-event-lifecycle"/>
+    <w:bookmarkEnd w:id="76"/>
+    <w:bookmarkStart w:id="77" w:name="max-date-changes-per-event-lifecycle"/>
     <w:p>
       <w:pPr>
         <w:pStyle w:val="Heading3"/>
@@ -16372,9 +16825,9 @@
         </w:pict>
       </w:r>
     </w:p>
-    <w:bookmarkEnd w:id="75"/>
-    <w:bookmarkEnd w:id="76"/>
-    <w:bookmarkStart w:id="82" w:name="X513d2f198876b8fade7282903c355af47c02284"/>
+    <w:bookmarkEnd w:id="77"/>
+    <w:bookmarkEnd w:id="78"/>
+    <w:bookmarkStart w:id="84" w:name="X513d2f198876b8fade7282903c355af47c02284"/>
     <w:p>
       <w:pPr>
         <w:pStyle w:val="Heading2"/>
@@ -16419,7 +16872,7 @@
         <w:t xml:space="preserve">Additionally subject to per-vendor acceptance cutoffs (§ 13) — if any confirmed vendor is past their venue-change cutoff at the current proximity to event, the standard flow described below is blocked entirely and admin override is the only forward path.</w:t>
       </w:r>
     </w:p>
-    <w:bookmarkStart w:id="77" w:name="coverage-check-replaces-schedule-check"/>
+    <w:bookmarkStart w:id="79" w:name="coverage-check-replaces-schedule-check"/>
     <w:p>
       <w:pPr>
         <w:pStyle w:val="Heading3"/>
@@ -16609,8 +17062,8 @@
         <w:t xml:space="preserve">“Your venue change is available for X vendors but is in conflict for Y vendors. We cannot apply this change until all vendors accept.”</w:t>
       </w:r>
     </w:p>
-    <w:bookmarkEnd w:id="77"/>
-    <w:bookmarkStart w:id="78" w:name="X51c6bb87f2fa95b053791854b8ffc832b2c049e"/>
+    <w:bookmarkEnd w:id="79"/>
+    <w:bookmarkStart w:id="80" w:name="X51c6bb87f2fa95b053791854b8ffc832b2c049e"/>
     <w:p>
       <w:pPr>
         <w:pStyle w:val="Heading3"/>
@@ -16675,8 +17128,8 @@
         <w:t xml:space="preserve">This cuts negotiation volume materially for the common case (e.g., changing from one Tagaytay venue to another). Vendors who prefer explicit confirmation set the radius to 0 km and get the standard card on every venue change.</w:t>
       </w:r>
     </w:p>
-    <w:bookmarkEnd w:id="78"/>
-    <w:bookmarkStart w:id="79" w:name="X602bf220004dcc7f0ec908783e74592c548299e"/>
+    <w:bookmarkEnd w:id="80"/>
+    <w:bookmarkStart w:id="81" w:name="X602bf220004dcc7f0ec908783e74592c548299e"/>
     <w:p>
       <w:pPr>
         <w:pStyle w:val="Heading3"/>
@@ -16765,8 +17218,8 @@
         <w:t xml:space="preserve">The fee surfaces in the § 11 confirmation modal when at least one affected vendor has a non-zero relocation fee for the proposed venue. Same admin-mediator-applies-it pattern as § 10.9; auto-debit lands in 0034 Phase 2.</w:t>
       </w:r>
     </w:p>
-    <w:bookmarkEnd w:id="79"/>
-    <w:bookmarkStart w:id="80" w:name="mediation-outcomes-parallel-to-10.6"/>
+    <w:bookmarkEnd w:id="81"/>
+    <w:bookmarkStart w:id="82" w:name="mediation-outcomes-parallel-to-10.6"/>
     <w:p>
       <w:pPr>
         <w:pStyle w:val="Heading3"/>
@@ -16942,8 +17395,8 @@
         </w:tc>
       </w:tr>
     </w:tbl>
-    <w:bookmarkEnd w:id="80"/>
-    <w:bookmarkStart w:id="81" w:name="Xddcf60fb9307e956a9b8df6a249ddf34dcd2f34"/>
+    <w:bookmarkEnd w:id="82"/>
+    <w:bookmarkStart w:id="83" w:name="Xddcf60fb9307e956a9b8df6a249ddf34dcd2f34"/>
     <w:p>
       <w:pPr>
         <w:pStyle w:val="Heading3"/>
@@ -16991,9 +17444,9 @@
         </w:pict>
       </w:r>
     </w:p>
-    <w:bookmarkEnd w:id="81"/>
-    <w:bookmarkEnd w:id="82"/>
-    <w:bookmarkStart w:id="92" w:name="X0ee670164d8e6b881670a2805d0ec06f62abd0d"/>
+    <w:bookmarkEnd w:id="83"/>
+    <w:bookmarkEnd w:id="84"/>
+    <w:bookmarkStart w:id="94" w:name="X0ee670164d8e6b881670a2805d0ec06f62abd0d"/>
     <w:p>
       <w:pPr>
         <w:pStyle w:val="Heading2"/>
@@ -17054,7 +17507,7 @@
         <w:t xml:space="preserve">Additionally subject to per-vendor acceptance cutoffs (§ 13) — if any confirmed guest-count-dependent vendor is past their guest-count cutoff at the current proximity to event, the standard increase flow described below is blocked entirely and admin override is the only forward path.</w:t>
       </w:r>
     </w:p>
-    <w:bookmarkStart w:id="83" w:name="which-vendors-are-guest-count-dependent"/>
+    <w:bookmarkStart w:id="85" w:name="which-vendors-are-guest-count-dependent"/>
     <w:p>
       <w:pPr>
         <w:pStyle w:val="Heading3"/>
@@ -17497,8 +17950,8 @@
         <w:t xml:space="preserve">Only dependent vendors receive the confirmation card on a guest-count change. Independent vendors are notified passively (in-app + email) but their booking is unaffected.</w:t>
       </w:r>
     </w:p>
-    <w:bookmarkEnd w:id="83"/>
-    <w:bookmarkStart w:id="84" w:name="the-ratchet-rule"/>
+    <w:bookmarkEnd w:id="85"/>
+    <w:bookmarkStart w:id="86" w:name="the-ratchet-rule"/>
     <w:p>
       <w:pPr>
         <w:pStyle w:val="Heading3"/>
@@ -17700,8 +18153,8 @@
         <w:t xml:space="preserve">Vendors plan against the planning count. RSVPs may come in lower; the couple still pays for the committed count because vendors have already committed inventory + crew at that level.</w:t>
       </w:r>
     </w:p>
-    <w:bookmarkEnd w:id="84"/>
-    <w:bookmarkStart w:id="85" w:name="confirmation-gate-only-on-increase"/>
+    <w:bookmarkEnd w:id="86"/>
+    <w:bookmarkStart w:id="87" w:name="confirmation-gate-only-on-increase"/>
     <w:p>
       <w:pPr>
         <w:pStyle w:val="Heading3"/>
@@ -17878,8 +18331,8 @@
         <w:t xml:space="preserve">Per-head pricing is captured at vendor booking (0006); the modal surfaces a real-time delta calculation before the couple commits.</w:t>
       </w:r>
     </w:p>
-    <w:bookmarkEnd w:id="85"/>
-    <w:bookmarkStart w:id="86" w:name="X1766aa9c7b6619d83f7fc39b7c9a12866cb567f"/>
+    <w:bookmarkEnd w:id="87"/>
+    <w:bookmarkStart w:id="88" w:name="X1766aa9c7b6619d83f7fc39b7c9a12866cb567f"/>
     <w:p>
       <w:pPr>
         <w:pStyle w:val="Heading3"/>
@@ -18017,8 +18470,8 @@
         <w:t xml:space="preserve">“Your guest count change is available for X vendors but exceeds capacity for Y vendors. We cannot apply this change until all vendors accept.”</w:t>
       </w:r>
     </w:p>
-    <w:bookmarkEnd w:id="86"/>
-    <w:bookmarkStart w:id="87" w:name="vendor-response-window-chat-negotiation"/>
+    <w:bookmarkEnd w:id="88"/>
+    <w:bookmarkStart w:id="89" w:name="vendor-response-window-chat-negotiation"/>
     <w:p>
       <w:pPr>
         <w:pStyle w:val="Heading3"/>
@@ -18035,8 +18488,8 @@
         <w:t xml:space="preserve">Identical to § 10.4–10.5 with capacity-specific outcomes. Vendor accepts → commits to the new count + new price. Vendor declines → chat negotiation with structured cards (Propose alternate count / Accept this count / Cancel booking / Escalate to support). 48 hr / 72 hr timeouts as before.</w:t>
       </w:r>
     </w:p>
-    <w:bookmarkEnd w:id="87"/>
-    <w:bookmarkStart w:id="88" w:name="ratchet-enforcement-on-vendor-back-out"/>
+    <w:bookmarkEnd w:id="89"/>
+    <w:bookmarkStart w:id="90" w:name="ratchet-enforcement-on-vendor-back-out"/>
     <w:p>
       <w:pPr>
         <w:pStyle w:val="Heading3"/>
@@ -18090,8 +18543,8 @@
         <w:t xml:space="preserve">vendor joins later, their starting commitment is the current floor (or higher, never lower). Vendors who cannot meet the current floor at onboarding aren’t bookable — the catalog gates them out for this event.</w:t>
       </w:r>
     </w:p>
-    <w:bookmarkEnd w:id="88"/>
-    <w:bookmarkStart w:id="89" w:name="decrease-override-admin-mediated"/>
+    <w:bookmarkEnd w:id="90"/>
+    <w:bookmarkStart w:id="91" w:name="decrease-override-admin-mediated"/>
     <w:p>
       <w:pPr>
         <w:pStyle w:val="Heading3"/>
@@ -18165,8 +18618,8 @@
         <w:t xml:space="preserve">, not event-wide — because vendors negotiate individually based on their inventory commitment. This is the only path through which the floor can move downward; it does not surface in the couple’s UI as a self-serve affordance.</w:t>
       </w:r>
     </w:p>
-    <w:bookmarkEnd w:id="89"/>
-    <w:bookmarkStart w:id="90" w:name="seating-chart-side-effects"/>
+    <w:bookmarkEnd w:id="91"/>
+    <w:bookmarkStart w:id="92" w:name="seating-chart-side-effects"/>
     <w:p>
       <w:pPr>
         <w:pStyle w:val="Heading3"/>
@@ -18321,8 +18774,8 @@
         <w:t xml:space="preserve">These are passive side-effects (no additional confirmation needed) because the vendor side already accepted the new count.</w:t>
       </w:r>
     </w:p>
-    <w:bookmarkEnd w:id="90"/>
-    <w:bookmarkStart w:id="91" w:name="audit-ratchet-history"/>
+    <w:bookmarkEnd w:id="92"/>
+    <w:bookmarkStart w:id="93" w:name="audit-ratchet-history"/>
     <w:p>
       <w:pPr>
         <w:pStyle w:val="Heading3"/>
@@ -18414,9 +18867,9 @@
         </w:pict>
       </w:r>
     </w:p>
-    <w:bookmarkEnd w:id="91"/>
-    <w:bookmarkEnd w:id="92"/>
-    <w:bookmarkStart w:id="101" w:name="X11ccce14768150bd7357093b936830680b75a56"/>
+    <w:bookmarkEnd w:id="93"/>
+    <w:bookmarkEnd w:id="94"/>
+    <w:bookmarkStart w:id="103" w:name="X11ccce14768150bd7357093b936830680b75a56"/>
     <w:p>
       <w:pPr>
         <w:pStyle w:val="Heading2"/>
@@ -18473,7 +18926,7 @@
         <w:t xml:space="preserve">Applies uniformly to all three change types (date, venue, guest count). Applies only to vendor bookings — Setnayan platform SKUs (Papic, Panood, Patiktok, LED, AI Highlights, etc.) have their own pre-event activation / rendering / fulfillment windows handled separately.</w:t>
       </w:r>
     </w:p>
-    <w:bookmarkStart w:id="93" w:name="the-three-cutoff-fields"/>
+    <w:bookmarkStart w:id="95" w:name="the-three-cutoff-fields"/>
     <w:p>
       <w:pPr>
         <w:pStyle w:val="Heading3"/>
@@ -18727,8 +19180,8 @@
         <w:t xml:space="preserve">— e.g., a cutoff of T-30 means the change can be initiated up to and including the calendar day 30 days before the event. Day T-29 is past cutoff. Day-end is the cliff (Asia/Manila timezone).</w:t>
       </w:r>
     </w:p>
-    <w:bookmarkEnd w:id="93"/>
-    <w:bookmarkStart w:id="94" w:name="v1-default-values-by-vendor-category"/>
+    <w:bookmarkEnd w:id="95"/>
+    <w:bookmarkStart w:id="96" w:name="v1-default-values-by-vendor-category"/>
     <w:p>
       <w:pPr>
         <w:pStyle w:val="Heading3"/>
@@ -19414,8 +19867,8 @@
         <w:t xml:space="preserve">— owner should review and adjust based on real vendor feedback during V1 onboarding. Vendors retain final say.</w:t>
       </w:r>
     </w:p>
-    <w:bookmarkEnd w:id="94"/>
-    <w:bookmarkStart w:id="95" w:name="pre-flight-check-on-every-change-attempt"/>
+    <w:bookmarkEnd w:id="96"/>
+    <w:bookmarkStart w:id="97" w:name="pre-flight-check-on-every-change-attempt"/>
     <w:p>
       <w:pPr>
         <w:pStyle w:val="Heading3"/>
@@ -19532,8 +19985,8 @@
         </w:tc>
       </w:tr>
     </w:tbl>
-    <w:bookmarkEnd w:id="95"/>
-    <w:bookmarkStart w:id="96" w:name="past-cutoff-modal-copy"/>
+    <w:bookmarkEnd w:id="97"/>
+    <w:bookmarkStart w:id="98" w:name="past-cutoff-modal-copy"/>
     <w:p>
       <w:pPr>
         <w:pStyle w:val="Heading3"/>
@@ -19663,8 +20116,8 @@
         <w:t xml:space="preserve">CTA routes to 0029 help center with the form pre-populated (change type, affected vendors, current proximity). Couple supplies the reason there; admin mediator picks it up (§ 13.6).</w:t>
       </w:r>
     </w:p>
-    <w:bookmarkEnd w:id="96"/>
-    <w:bookmarkStart w:id="97" w:name="X1e9d3462ded11f74631e67649aa955f682d8f1d"/>
+    <w:bookmarkEnd w:id="98"/>
+    <w:bookmarkStart w:id="99" w:name="X1e9d3462ded11f74631e67649aa955f682d8f1d"/>
     <w:p>
       <w:pPr>
         <w:pStyle w:val="Heading3"/>
@@ -19771,8 +20224,8 @@
         <w:t xml:space="preserve">. The vendor’s own dashboard (0022) shows both the live values and a per-event snapshot table when applicable — they need to know what they’ve committed to for in-flight events.</w:t>
       </w:r>
     </w:p>
-    <w:bookmarkEnd w:id="97"/>
-    <w:bookmarkStart w:id="98" w:name="in-flight-protection"/>
+    <w:bookmarkEnd w:id="99"/>
+    <w:bookmarkStart w:id="100" w:name="in-flight-protection"/>
     <w:p>
       <w:pPr>
         <w:pStyle w:val="Heading3"/>
@@ -19821,8 +20274,8 @@
         <w:t xml:space="preserve">This prevents the system from auto-failing valid changes just because a vendor took a long time to respond.</w:t>
       </w:r>
     </w:p>
-    <w:bookmarkEnd w:id="98"/>
-    <w:bookmarkStart w:id="99" w:name="admin-override-path"/>
+    <w:bookmarkEnd w:id="100"/>
+    <w:bookmarkStart w:id="101" w:name="admin-override-path"/>
     <w:p>
       <w:pPr>
         <w:pStyle w:val="Heading3"/>
@@ -19954,8 +20407,8 @@
         <w:t xml:space="preserve">, the original cutoff value, the proximity at which the override applied, and the mediator’s notes. Useful for refining V1 defaults — if a category consistently grants overrides, the seed value is too conservative.</w:t>
       </w:r>
     </w:p>
-    <w:bookmarkEnd w:id="99"/>
-    <w:bookmarkStart w:id="100" w:name="X887e9493772a1c2c0341e5339edb8551feae36b"/>
+    <w:bookmarkEnd w:id="101"/>
+    <w:bookmarkStart w:id="102" w:name="X887e9493772a1c2c0341e5339edb8551feae36b"/>
     <w:p>
       <w:pPr>
         <w:pStyle w:val="Heading3"/>
@@ -20031,9 +20484,9 @@
         </w:pict>
       </w:r>
     </w:p>
-    <w:bookmarkEnd w:id="100"/>
-    <w:bookmarkEnd w:id="101"/>
-    <w:bookmarkStart w:id="102" w:name="companions"/>
+    <w:bookmarkEnd w:id="102"/>
+    <w:bookmarkEnd w:id="103"/>
+    <w:bookmarkStart w:id="104" w:name="companions"/>
     <w:p>
       <w:pPr>
         <w:pStyle w:val="Heading2"/>
@@ -20091,8 +20544,8 @@
         </w:pict>
       </w:r>
     </w:p>
-    <w:bookmarkEnd w:id="102"/>
-    <w:bookmarkStart w:id="109" w:name="X8002883386650ce5f4b3369197ab928d81be00c"/>
+    <w:bookmarkEnd w:id="104"/>
+    <w:bookmarkStart w:id="111" w:name="X8002883386650ce5f4b3369197ab928d81be00c"/>
     <w:p>
       <w:pPr>
         <w:pStyle w:val="Heading2"/>
@@ -20111,7 +20564,7 @@
       <w:r>
         <w:t xml:space="preserve"> </w:t>
       </w:r>
-      <w:hyperlink r:id="rId103">
+      <w:hyperlink r:id="rId105">
         <w:r>
           <w:rPr>
             <w:rStyle w:val="Hyperlink"/>
@@ -20128,7 +20581,7 @@
       <w:r>
         <w:t xml:space="preserve"> </w:t>
       </w:r>
-      <w:hyperlink r:id="rId104">
+      <w:hyperlink r:id="rId106">
         <w:r>
           <w:rPr>
             <w:rStyle w:val="Hyperlink"/>
@@ -20180,7 +20633,7 @@
         <w:t xml:space="preserve">.</w:t>
       </w:r>
     </w:p>
-    <w:bookmarkStart w:id="105" w:name="header-changes"/>
+    <w:bookmarkStart w:id="107" w:name="header-changes"/>
     <w:p>
       <w:pPr>
         <w:pStyle w:val="Heading3"/>
@@ -20247,7 +20700,7 @@
       <w:r>
         <w:t xml:space="preserve"> </w:t>
       </w:r>
-      <w:hyperlink r:id="rId103">
+      <w:hyperlink r:id="rId105">
         <w:r>
           <w:rPr>
             <w:rStyle w:val="Hyperlink"/>
@@ -20259,8 +20712,8 @@
         <w:t xml:space="preserve">).</w:t>
       </w:r>
     </w:p>
-    <w:bookmarkEnd w:id="105"/>
-    <w:bookmarkStart w:id="106" w:name="visibility-aware-rendering"/>
+    <w:bookmarkEnd w:id="107"/>
+    <w:bookmarkStart w:id="108" w:name="visibility-aware-rendering"/>
     <w:p>
       <w:pPr>
         <w:pStyle w:val="Heading3"/>
@@ -20339,7 +20792,7 @@
       <w:r>
         <w:t xml:space="preserve"> </w:t>
       </w:r>
-      <w:hyperlink r:id="rId103">
+      <w:hyperlink r:id="rId105">
         <w:r>
           <w:rPr>
             <w:rStyle w:val="Hyperlink"/>
@@ -20468,7 +20921,7 @@
       <w:r>
         <w:t xml:space="preserve"> </w:t>
       </w:r>
-      <w:hyperlink r:id="rId104">
+      <w:hyperlink r:id="rId106">
         <w:r>
           <w:rPr>
             <w:rStyle w:val="Hyperlink"/>
@@ -20554,8 +21007,8 @@
         <w:t xml:space="preserve">until day-of.</w:t>
       </w:r>
     </w:p>
-    <w:bookmarkEnd w:id="106"/>
-    <w:bookmarkStart w:id="107" w:name="new-surface-dashboardeventidmoderators"/>
+    <w:bookmarkEnd w:id="108"/>
+    <w:bookmarkStart w:id="109" w:name="new-surface-dashboardeventidmoderators"/>
     <w:p>
       <w:pPr>
         <w:pStyle w:val="Heading3"/>
@@ -20583,7 +21036,7 @@
       <w:r>
         <w:t xml:space="preserve"> </w:t>
       </w:r>
-      <w:hyperlink r:id="rId103">
+      <w:hyperlink r:id="rId105">
         <w:r>
           <w:rPr>
             <w:rStyle w:val="Hyperlink"/>
@@ -20619,8 +21072,8 @@
         <w:t xml:space="preserve">permission.</w:t>
       </w:r>
     </w:p>
-    <w:bookmarkEnd w:id="107"/>
-    <w:bookmarkStart w:id="108" w:name="forward-compat-note"/>
+    <w:bookmarkEnd w:id="109"/>
+    <w:bookmarkStart w:id="110" w:name="forward-compat-note"/>
     <w:p>
       <w:pPr>
         <w:pStyle w:val="Heading3"/>
@@ -20709,9 +21162,9 @@
         <w:t xml:space="preserve">moderator rows.</w:t>
       </w:r>
     </w:p>
-    <w:bookmarkEnd w:id="108"/>
-    <w:bookmarkEnd w:id="109"/>
     <w:bookmarkEnd w:id="110"/>
+    <w:bookmarkEnd w:id="111"/>
+    <w:bookmarkEnd w:id="112"/>
     <w:sectPr>
       <w:footnotePr>
         <w:numRestart w:val="eachSect"/>

</xml_diff>